<commit_message>
Add card-guarantee note to reservation form and sample
</commit_message>
<xml_diff>
--- a/downloads/GRN-BRI2026_BestWestern_Reservation_Form.docx
+++ b/downloads/GRN-BRI2026_BestWestern_Reservation_Form.docx
@@ -115,7 +115,7 @@
     </w:tbl>
     <w:p>
       <w:pPr>
-        <w:spacing w:after="60" w:before="60" w:line="220" w:lineRule="exact"/>
+        <w:spacing w:after="0" w:before="60" w:line="220" w:lineRule="exact"/>
       </w:pPr>
       <w:r>
         <w:rPr>
@@ -143,6 +143,21 @@
           <w:szCs w:val="16"/>
         </w:rPr>
         <w:t xml:space="preserve"> must be completed.</w:t>
+      </w:r>
+    </w:p>
+    <w:p>
+      <w:pPr>
+        <w:spacing w:after="60" w:before="0" w:line="220" w:lineRule="exact"/>
+      </w:pPr>
+      <w:r>
+        <w:rPr>
+          <w:rFonts w:ascii="Malgun Gothic" w:cs="Malgun Gothic" w:eastAsia="Malgun Gothic" w:hAnsi="Malgun Gothic"/>
+          <w:b/>
+          <w:bCs/>
+          <w:sz w:val="16"/>
+          <w:szCs w:val="16"/>
+        </w:rPr>
+        <w:t xml:space="preserve">Your credit card details are used only to guarantee the booking. You pay the hotel directly at check-in.</w:t>
       </w:r>
     </w:p>
     <w:tbl>

</xml_diff>